<commit_message>
Add unit tests, CI pipeline, compose manifest, and health endpoints
</commit_message>
<xml_diff>
--- a/Doc1.docx
+++ b/Doc1.docx
@@ -4,21 +4,392 @@
   <w:body>
     <w:p>
       <w:pPr>
-        <w:rPr>
-          <w:u w:val="single"/>
-        </w:rPr>
-      </w:pPr>
-      <w:r>
-        <w:rPr>
-          <w:u w:val="single"/>
-        </w:rPr>
-        <w:t>Screenshot 1</w:t>
+        <w:spacing w:before="100" w:beforeAutospacing="1" w:after="100" w:afterAutospacing="1"/>
+        <w:outlineLvl w:val="0"/>
+        <w:rPr>
+          <w:rFonts w:ascii="Times New Roman" w:eastAsia="Times New Roman" w:hAnsi="Times New Roman" w:cs="Times New Roman"/>
+          <w:b/>
+          <w:bCs/>
+          <w:color w:val="000000"/>
+          <w:kern w:val="36"/>
+          <w:sz w:val="48"/>
+          <w:szCs w:val="48"/>
+          <w:lang w:eastAsia="en-GB"/>
+          <w14:ligatures w14:val="none"/>
+        </w:rPr>
+      </w:pPr>
+      <w:proofErr w:type="spellStart"/>
+      <w:r>
+        <w:rPr>
+          <w:rFonts w:ascii="Times New Roman" w:eastAsia="Times New Roman" w:hAnsi="Times New Roman" w:cs="Times New Roman"/>
+          <w:b/>
+          <w:bCs/>
+          <w:color w:val="000000"/>
+          <w:kern w:val="36"/>
+          <w:sz w:val="48"/>
+          <w:szCs w:val="48"/>
+          <w:lang w:eastAsia="en-GB"/>
+          <w14:ligatures w14:val="none"/>
+        </w:rPr>
+        <w:t>MLOps</w:t>
+      </w:r>
+      <w:proofErr w:type="spellEnd"/>
+      <w:r>
+        <w:rPr>
+          <w:rFonts w:ascii="Times New Roman" w:eastAsia="Times New Roman" w:hAnsi="Times New Roman" w:cs="Times New Roman"/>
+          <w:b/>
+          <w:bCs/>
+          <w:color w:val="000000"/>
+          <w:kern w:val="36"/>
+          <w:sz w:val="48"/>
+          <w:szCs w:val="48"/>
+          <w:lang w:eastAsia="en-GB"/>
+          <w14:ligatures w14:val="none"/>
+        </w:rPr>
+        <w:t xml:space="preserve"> Assignment 2: End-to-End Deep Learning Pipeline</w:t>
       </w:r>
     </w:p>
     <w:p>
+      <w:pPr>
+        <w:spacing w:before="100" w:beforeAutospacing="1" w:after="100" w:afterAutospacing="1"/>
+        <w:rPr>
+          <w:rFonts w:ascii="Times New Roman" w:eastAsia="Times New Roman" w:hAnsi="Times New Roman" w:cs="Times New Roman"/>
+          <w:color w:val="000000"/>
+          <w:kern w:val="0"/>
+          <w:lang w:eastAsia="en-GB"/>
+          <w14:ligatures w14:val="none"/>
+        </w:rPr>
+      </w:pPr>
+      <w:r>
+        <w:rPr>
+          <w:rFonts w:ascii="Times New Roman" w:eastAsia="Times New Roman" w:hAnsi="Times New Roman" w:cs="Times New Roman"/>
+          <w:b/>
+          <w:bCs/>
+          <w:color w:val="000000"/>
+          <w:kern w:val="0"/>
+          <w:lang w:eastAsia="en-GB"/>
+          <w14:ligatures w14:val="none"/>
+        </w:rPr>
+        <w:t>GitHub Repository:</w:t>
+      </w:r>
+      <w:r>
+        <w:rPr>
+          <w:rFonts w:ascii="Times New Roman" w:eastAsia="Times New Roman" w:hAnsi="Times New Roman" w:cs="Times New Roman"/>
+          <w:color w:val="000000"/>
+          <w:kern w:val="0"/>
+          <w:lang w:eastAsia="en-GB"/>
+          <w14:ligatures w14:val="none"/>
+        </w:rPr>
+        <w:t> </w:t>
+      </w:r>
+      <w:hyperlink r:id="rId5" w:tgtFrame="_blank" w:history="1">
+        <w:r>
+          <w:rPr>
+            <w:rFonts w:ascii="Times New Roman" w:eastAsia="Times New Roman" w:hAnsi="Times New Roman" w:cs="Times New Roman"/>
+            <w:color w:val="0000FF"/>
+            <w:kern w:val="0"/>
+            <w:u w:val="single"/>
+            <w:lang w:eastAsia="en-GB"/>
+            <w14:ligatures w14:val="none"/>
+          </w:rPr>
+          <w:t>https://github.com/earlpratiksinha/MLOpsAssignment2.git</w:t>
+        </w:r>
+      </w:hyperlink>
+    </w:p>
+    <w:p>
+      <w:pPr>
+        <w:spacing w:before="100" w:beforeAutospacing="1" w:after="100" w:afterAutospacing="1"/>
+        <w:outlineLvl w:val="1"/>
+        <w:rPr>
+          <w:rFonts w:ascii="Times New Roman" w:eastAsia="Times New Roman" w:hAnsi="Times New Roman" w:cs="Times New Roman"/>
+          <w:b/>
+          <w:bCs/>
+          <w:color w:val="000000"/>
+          <w:kern w:val="0"/>
+          <w:sz w:val="36"/>
+          <w:szCs w:val="36"/>
+          <w:lang w:eastAsia="en-GB"/>
+          <w14:ligatures w14:val="none"/>
+        </w:rPr>
+      </w:pPr>
+      <w:r>
+        <w:rPr>
+          <w:rFonts w:ascii="Times New Roman" w:eastAsia="Times New Roman" w:hAnsi="Times New Roman" w:cs="Times New Roman"/>
+          <w:b/>
+          <w:bCs/>
+          <w:color w:val="000000"/>
+          <w:kern w:val="0"/>
+          <w:sz w:val="36"/>
+          <w:szCs w:val="36"/>
+          <w:lang w:eastAsia="en-GB"/>
+          <w14:ligatures w14:val="none"/>
+        </w:rPr>
+        <w:t>1. Model Training &amp; Pipeline Verification</w:t>
+      </w:r>
+    </w:p>
+    <w:p>
+      <w:pPr>
+        <w:spacing w:before="100" w:beforeAutospacing="1" w:after="100" w:afterAutospacing="1"/>
+        <w:rPr>
+          <w:rFonts w:ascii="Times New Roman" w:eastAsia="Times New Roman" w:hAnsi="Times New Roman" w:cs="Times New Roman"/>
+          <w:color w:val="000000"/>
+          <w:kern w:val="0"/>
+          <w:lang w:eastAsia="en-GB"/>
+          <w14:ligatures w14:val="none"/>
+        </w:rPr>
+      </w:pPr>
+      <w:r>
+        <w:rPr>
+          <w:rFonts w:ascii="Times New Roman" w:eastAsia="Times New Roman" w:hAnsi="Times New Roman" w:cs="Times New Roman"/>
+          <w:color w:val="000000"/>
+          <w:kern w:val="0"/>
+          <w:lang w:eastAsia="en-GB"/>
+          <w14:ligatures w14:val="none"/>
+        </w:rPr>
+        <w:t xml:space="preserve">The model training was executed using </w:t>
+      </w:r>
+      <w:proofErr w:type="spellStart"/>
+      <w:r>
+        <w:rPr>
+          <w:rFonts w:ascii="Times New Roman" w:eastAsia="Times New Roman" w:hAnsi="Times New Roman" w:cs="Times New Roman"/>
+          <w:color w:val="000000"/>
+          <w:kern w:val="0"/>
+          <w:lang w:eastAsia="en-GB"/>
+          <w14:ligatures w14:val="none"/>
+        </w:rPr>
+        <w:t>PyTorch</w:t>
+      </w:r>
+      <w:proofErr w:type="spellEnd"/>
+      <w:r>
+        <w:rPr>
+          <w:rFonts w:ascii="Times New Roman" w:eastAsia="Times New Roman" w:hAnsi="Times New Roman" w:cs="Times New Roman"/>
+          <w:color w:val="000000"/>
+          <w:kern w:val="0"/>
+          <w:lang w:eastAsia="en-GB"/>
+          <w14:ligatures w14:val="none"/>
+        </w:rPr>
+        <w:t xml:space="preserve"> with transfer learning via MobileNetV2 over 5 training epochs.</w:t>
+      </w:r>
+    </w:p>
+    <w:p>
+      <w:pPr>
+        <w:numPr>
+          <w:ilvl w:val="0"/>
+          <w:numId w:val="1"/>
+        </w:numPr>
+        <w:spacing w:before="100" w:beforeAutospacing="1" w:after="100" w:afterAutospacing="1"/>
+        <w:rPr>
+          <w:rFonts w:ascii="Times New Roman" w:eastAsia="Times New Roman" w:hAnsi="Times New Roman" w:cs="Times New Roman"/>
+          <w:color w:val="000000"/>
+          <w:kern w:val="0"/>
+          <w:lang w:eastAsia="en-GB"/>
+          <w14:ligatures w14:val="none"/>
+        </w:rPr>
+      </w:pPr>
+      <w:r>
+        <w:rPr>
+          <w:rFonts w:ascii="Times New Roman" w:eastAsia="Times New Roman" w:hAnsi="Times New Roman" w:cs="Times New Roman"/>
+          <w:b/>
+          <w:bCs/>
+          <w:color w:val="000000"/>
+          <w:kern w:val="0"/>
+          <w:lang w:eastAsia="en-GB"/>
+          <w14:ligatures w14:val="none"/>
+        </w:rPr>
+        <w:t>Training Results:</w:t>
+      </w:r>
+      <w:r>
+        <w:rPr>
+          <w:rFonts w:ascii="Times New Roman" w:eastAsia="Times New Roman" w:hAnsi="Times New Roman" w:cs="Times New Roman"/>
+          <w:color w:val="000000"/>
+          <w:kern w:val="0"/>
+          <w:lang w:eastAsia="en-GB"/>
+          <w14:ligatures w14:val="none"/>
+        </w:rPr>
+        <w:t> Final Training Loss reached </w:t>
+      </w:r>
+      <w:r>
+        <w:rPr>
+          <w:rFonts w:ascii="Times New Roman" w:eastAsia="Times New Roman" w:hAnsi="Times New Roman" w:cs="Times New Roman"/>
+          <w:b/>
+          <w:bCs/>
+          <w:color w:val="000000"/>
+          <w:kern w:val="0"/>
+          <w:lang w:eastAsia="en-GB"/>
+          <w14:ligatures w14:val="none"/>
+        </w:rPr>
+        <w:t>0.0498</w:t>
+      </w:r>
+      <w:r>
+        <w:rPr>
+          <w:rFonts w:ascii="Times New Roman" w:eastAsia="Times New Roman" w:hAnsi="Times New Roman" w:cs="Times New Roman"/>
+          <w:color w:val="000000"/>
+          <w:kern w:val="0"/>
+          <w:lang w:eastAsia="en-GB"/>
+          <w14:ligatures w14:val="none"/>
+        </w:rPr>
+        <w:t> with a Training Accuracy of </w:t>
+      </w:r>
+      <w:r>
+        <w:rPr>
+          <w:rFonts w:ascii="Times New Roman" w:eastAsia="Times New Roman" w:hAnsi="Times New Roman" w:cs="Times New Roman"/>
+          <w:b/>
+          <w:bCs/>
+          <w:color w:val="000000"/>
+          <w:kern w:val="0"/>
+          <w:lang w:eastAsia="en-GB"/>
+          <w14:ligatures w14:val="none"/>
+        </w:rPr>
+        <w:t>98.15%</w:t>
+      </w:r>
+      <w:r>
+        <w:rPr>
+          <w:rFonts w:ascii="Times New Roman" w:eastAsia="Times New Roman" w:hAnsi="Times New Roman" w:cs="Times New Roman"/>
+          <w:color w:val="000000"/>
+          <w:kern w:val="0"/>
+          <w:lang w:eastAsia="en-GB"/>
+          <w14:ligatures w14:val="none"/>
+        </w:rPr>
+        <w:t>. Final Validation Loss landed at </w:t>
+      </w:r>
+      <w:r>
+        <w:rPr>
+          <w:rFonts w:ascii="Times New Roman" w:eastAsia="Times New Roman" w:hAnsi="Times New Roman" w:cs="Times New Roman"/>
+          <w:b/>
+          <w:bCs/>
+          <w:color w:val="000000"/>
+          <w:kern w:val="0"/>
+          <w:lang w:eastAsia="en-GB"/>
+          <w14:ligatures w14:val="none"/>
+        </w:rPr>
+        <w:t>0.0681</w:t>
+      </w:r>
+      <w:r>
+        <w:rPr>
+          <w:rFonts w:ascii="Times New Roman" w:eastAsia="Times New Roman" w:hAnsi="Times New Roman" w:cs="Times New Roman"/>
+          <w:color w:val="000000"/>
+          <w:kern w:val="0"/>
+          <w:lang w:eastAsia="en-GB"/>
+          <w14:ligatures w14:val="none"/>
+        </w:rPr>
+        <w:t> with a Validation Accuracy of </w:t>
+      </w:r>
+      <w:r>
+        <w:rPr>
+          <w:rFonts w:ascii="Times New Roman" w:eastAsia="Times New Roman" w:hAnsi="Times New Roman" w:cs="Times New Roman"/>
+          <w:b/>
+          <w:bCs/>
+          <w:color w:val="000000"/>
+          <w:kern w:val="0"/>
+          <w:lang w:eastAsia="en-GB"/>
+          <w14:ligatures w14:val="none"/>
+        </w:rPr>
+        <w:t>97.36%</w:t>
+      </w:r>
+      <w:r>
+        <w:rPr>
+          <w:rFonts w:ascii="Times New Roman" w:eastAsia="Times New Roman" w:hAnsi="Times New Roman" w:cs="Times New Roman"/>
+          <w:color w:val="000000"/>
+          <w:kern w:val="0"/>
+          <w:lang w:eastAsia="en-GB"/>
+          <w14:ligatures w14:val="none"/>
+        </w:rPr>
+        <w:t>.</w:t>
+      </w:r>
+    </w:p>
+    <w:p>
+      <w:pPr>
+        <w:numPr>
+          <w:ilvl w:val="0"/>
+          <w:numId w:val="1"/>
+        </w:numPr>
+        <w:spacing w:before="100" w:beforeAutospacing="1" w:after="100" w:afterAutospacing="1"/>
+        <w:rPr>
+          <w:rFonts w:ascii="Times New Roman" w:eastAsia="Times New Roman" w:hAnsi="Times New Roman" w:cs="Times New Roman"/>
+          <w:color w:val="000000"/>
+          <w:kern w:val="0"/>
+          <w:lang w:eastAsia="en-GB"/>
+          <w14:ligatures w14:val="none"/>
+        </w:rPr>
+      </w:pPr>
+      <w:r>
+        <w:rPr>
+          <w:rFonts w:ascii="Times New Roman" w:eastAsia="Times New Roman" w:hAnsi="Times New Roman" w:cs="Times New Roman"/>
+          <w:b/>
+          <w:bCs/>
+          <w:color w:val="000000"/>
+          <w:kern w:val="0"/>
+          <w:lang w:eastAsia="en-GB"/>
+          <w14:ligatures w14:val="none"/>
+        </w:rPr>
+        <w:t>Artifact Storage:</w:t>
+      </w:r>
+      <w:r>
+        <w:rPr>
+          <w:rFonts w:ascii="Times New Roman" w:eastAsia="Times New Roman" w:hAnsi="Times New Roman" w:cs="Times New Roman"/>
+          <w:color w:val="000000"/>
+          <w:kern w:val="0"/>
+          <w:lang w:eastAsia="en-GB"/>
+          <w14:ligatures w14:val="none"/>
+        </w:rPr>
+        <w:t> The trained model state dictionary was saved to </w:t>
+      </w:r>
+      <w:r>
+        <w:rPr>
+          <w:rFonts w:ascii="Courier New" w:eastAsia="Times New Roman" w:hAnsi="Courier New" w:cs="Courier New"/>
+          <w:color w:val="000000"/>
+          <w:kern w:val="0"/>
+          <w:sz w:val="20"/>
+          <w:szCs w:val="20"/>
+          <w:lang w:eastAsia="en-GB"/>
+          <w14:ligatures w14:val="none"/>
+        </w:rPr>
+        <w:t>models/</w:t>
+      </w:r>
+      <w:proofErr w:type="spellStart"/>
+      <w:r>
+        <w:rPr>
+          <w:rFonts w:ascii="Courier New" w:eastAsia="Times New Roman" w:hAnsi="Courier New" w:cs="Courier New"/>
+          <w:color w:val="000000"/>
+          <w:kern w:val="0"/>
+          <w:sz w:val="20"/>
+          <w:szCs w:val="20"/>
+          <w:lang w:eastAsia="en-GB"/>
+          <w14:ligatures w14:val="none"/>
+        </w:rPr>
+        <w:t>best_model.pth</w:t>
+      </w:r>
+      <w:proofErr w:type="spellEnd"/>
+      <w:r>
+        <w:rPr>
+          <w:rFonts w:ascii="Times New Roman" w:eastAsia="Times New Roman" w:hAnsi="Times New Roman" w:cs="Times New Roman"/>
+          <w:color w:val="000000"/>
+          <w:kern w:val="0"/>
+          <w:lang w:eastAsia="en-GB"/>
+          <w14:ligatures w14:val="none"/>
+        </w:rPr>
+        <w:t>.</w:t>
+      </w:r>
+    </w:p>
+    <w:p>
+      <w:pPr>
+        <w:spacing w:before="100" w:beforeAutospacing="1" w:after="100" w:afterAutospacing="1"/>
+        <w:outlineLvl w:val="1"/>
+        <w:rPr>
+          <w:rFonts w:ascii="Times New Roman" w:eastAsia="Times New Roman" w:hAnsi="Times New Roman" w:cs="Times New Roman"/>
+          <w:b/>
+          <w:bCs/>
+          <w:color w:val="000000"/>
+          <w:kern w:val="0"/>
+          <w:sz w:val="36"/>
+          <w:szCs w:val="36"/>
+          <w:lang w:eastAsia="en-GB"/>
+          <w14:ligatures w14:val="none"/>
+        </w:rPr>
+      </w:pPr>
       <w:r>
         <w:drawing>
-          <wp:inline distT="0" distB="0" distL="0" distR="0" wp14:anchorId="0BAD2D6C" wp14:editId="6AC5D974">
+          <wp:inline distT="0" distB="0" distL="0" distR="0" wp14:anchorId="08A3E07A" wp14:editId="11E75BE0">
             <wp:extent cx="5731510" cy="1344930"/>
             <wp:effectExtent l="0" t="0" r="0" b="1270"/>
             <wp:docPr id="1729595123" name="Picture 1"/>
@@ -33,7 +404,7 @@
                     <pic:cNvPicPr/>
                   </pic:nvPicPr>
                   <pic:blipFill>
-                    <a:blip r:embed="rId4"/>
+                    <a:blip r:embed="rId6"/>
                     <a:stretch>
                       <a:fillRect/>
                     </a:stretch>
@@ -54,24 +425,543 @@
         </w:drawing>
       </w:r>
     </w:p>
-    <w:p/>
     <w:p>
       <w:pPr>
-        <w:rPr>
-          <w:u w:val="single"/>
-        </w:rPr>
-      </w:pPr>
-      <w:r>
-        <w:rPr>
-          <w:u w:val="single"/>
-        </w:rPr>
-        <w:t>Screenshot 2</w:t>
-      </w:r>
+        <w:spacing w:before="100" w:beforeAutospacing="1" w:after="100" w:afterAutospacing="1"/>
+        <w:outlineLvl w:val="1"/>
+        <w:rPr>
+          <w:rFonts w:ascii="Times New Roman" w:eastAsia="Times New Roman" w:hAnsi="Times New Roman" w:cs="Times New Roman"/>
+          <w:b/>
+          <w:bCs/>
+          <w:color w:val="000000"/>
+          <w:kern w:val="0"/>
+          <w:sz w:val="36"/>
+          <w:szCs w:val="36"/>
+          <w:lang w:eastAsia="en-GB"/>
+          <w14:ligatures w14:val="none"/>
+        </w:rPr>
+      </w:pPr>
+      <w:r>
+        <w:rPr>
+          <w:rFonts w:ascii="Times New Roman" w:eastAsia="Times New Roman" w:hAnsi="Times New Roman" w:cs="Times New Roman"/>
+          <w:b/>
+          <w:bCs/>
+          <w:color w:val="000000"/>
+          <w:kern w:val="0"/>
+          <w:sz w:val="36"/>
+          <w:szCs w:val="36"/>
+          <w:lang w:eastAsia="en-GB"/>
+          <w14:ligatures w14:val="none"/>
+        </w:rPr>
+        <w:t xml:space="preserve">2. Experiment Tracking with </w:t>
+      </w:r>
+      <w:proofErr w:type="spellStart"/>
+      <w:r>
+        <w:rPr>
+          <w:rFonts w:ascii="Times New Roman" w:eastAsia="Times New Roman" w:hAnsi="Times New Roman" w:cs="Times New Roman"/>
+          <w:b/>
+          <w:bCs/>
+          <w:color w:val="000000"/>
+          <w:kern w:val="0"/>
+          <w:sz w:val="36"/>
+          <w:szCs w:val="36"/>
+          <w:lang w:eastAsia="en-GB"/>
+          <w14:ligatures w14:val="none"/>
+        </w:rPr>
+        <w:t>MLflow</w:t>
+      </w:r>
+      <w:proofErr w:type="spellEnd"/>
     </w:p>
     <w:p>
-      <w:r>
+      <w:pPr>
+        <w:spacing w:before="100" w:beforeAutospacing="1" w:after="100" w:afterAutospacing="1"/>
+        <w:rPr>
+          <w:rFonts w:ascii="Times New Roman" w:eastAsia="Times New Roman" w:hAnsi="Times New Roman" w:cs="Times New Roman"/>
+          <w:color w:val="000000"/>
+          <w:kern w:val="0"/>
+          <w:lang w:eastAsia="en-GB"/>
+          <w14:ligatures w14:val="none"/>
+        </w:rPr>
+      </w:pPr>
+      <w:r>
+        <w:rPr>
+          <w:rFonts w:ascii="Times New Roman" w:eastAsia="Times New Roman" w:hAnsi="Times New Roman" w:cs="Times New Roman"/>
+          <w:color w:val="000000"/>
+          <w:kern w:val="0"/>
+          <w:lang w:eastAsia="en-GB"/>
+          <w14:ligatures w14:val="none"/>
+        </w:rPr>
+        <w:t xml:space="preserve">All hyperparameter configurations, evaluation metrics, and model outputs were tracked using </w:t>
+      </w:r>
+      <w:proofErr w:type="spellStart"/>
+      <w:r>
+        <w:rPr>
+          <w:rFonts w:ascii="Times New Roman" w:eastAsia="Times New Roman" w:hAnsi="Times New Roman" w:cs="Times New Roman"/>
+          <w:color w:val="000000"/>
+          <w:kern w:val="0"/>
+          <w:lang w:eastAsia="en-GB"/>
+          <w14:ligatures w14:val="none"/>
+        </w:rPr>
+        <w:t>MLflow</w:t>
+      </w:r>
+      <w:proofErr w:type="spellEnd"/>
+      <w:r>
+        <w:rPr>
+          <w:rFonts w:ascii="Times New Roman" w:eastAsia="Times New Roman" w:hAnsi="Times New Roman" w:cs="Times New Roman"/>
+          <w:color w:val="000000"/>
+          <w:kern w:val="0"/>
+          <w:lang w:eastAsia="en-GB"/>
+          <w14:ligatures w14:val="none"/>
+        </w:rPr>
+        <w:t xml:space="preserve"> under the experiment run </w:t>
+      </w:r>
+      <w:r>
+        <w:rPr>
+          <w:rFonts w:ascii="Courier New" w:eastAsia="Times New Roman" w:hAnsi="Courier New" w:cs="Courier New"/>
+          <w:color w:val="000000"/>
+          <w:kern w:val="0"/>
+          <w:sz w:val="20"/>
+          <w:szCs w:val="20"/>
+          <w:lang w:eastAsia="en-GB"/>
+          <w14:ligatures w14:val="none"/>
+        </w:rPr>
+        <w:t>awesome-gnat-576</w:t>
+      </w:r>
+      <w:r>
+        <w:rPr>
+          <w:rFonts w:ascii="Times New Roman" w:eastAsia="Times New Roman" w:hAnsi="Times New Roman" w:cs="Times New Roman"/>
+          <w:color w:val="000000"/>
+          <w:kern w:val="0"/>
+          <w:lang w:eastAsia="en-GB"/>
+          <w14:ligatures w14:val="none"/>
+        </w:rPr>
+        <w:t>.</w:t>
+      </w:r>
+    </w:p>
+    <w:tbl>
+      <w:tblPr>
+        <w:tblW w:w="0" w:type="auto"/>
+        <w:tblCellSpacing w:w="15" w:type="dxa"/>
+        <w:tblCellMar>
+          <w:top w:w="15" w:type="dxa"/>
+          <w:left w:w="15" w:type="dxa"/>
+          <w:bottom w:w="15" w:type="dxa"/>
+          <w:right w:w="15" w:type="dxa"/>
+        </w:tblCellMar>
+        <w:tblLook w:val="04A0" w:firstRow="1" w:lastRow="0" w:firstColumn="1" w:lastColumn="0" w:noHBand="0" w:noVBand="1"/>
+      </w:tblPr>
+      <w:tblGrid>
+        <w:gridCol w:w="2189"/>
+        <w:gridCol w:w="1602"/>
+      </w:tblGrid>
+      <w:tr>
+        <w:trPr>
+          <w:tblHeader/>
+          <w:tblCellSpacing w:w="15" w:type="dxa"/>
+        </w:trPr>
+        <w:tc>
+          <w:tcPr>
+            <w:tcW w:w="0" w:type="auto"/>
+            <w:vAlign w:val="center"/>
+            <w:hideMark/>
+          </w:tcPr>
+          <w:p>
+            <w:pPr>
+              <w:jc w:val="center"/>
+              <w:rPr>
+                <w:rFonts w:ascii="Times New Roman" w:eastAsia="Times New Roman" w:hAnsi="Times New Roman" w:cs="Times New Roman"/>
+                <w:b/>
+                <w:bCs/>
+                <w:kern w:val="0"/>
+                <w:lang w:eastAsia="en-GB"/>
+                <w14:ligatures w14:val="none"/>
+              </w:rPr>
+            </w:pPr>
+            <w:r>
+              <w:rPr>
+                <w:rFonts w:ascii="Times New Roman" w:eastAsia="Times New Roman" w:hAnsi="Times New Roman" w:cs="Times New Roman"/>
+                <w:b/>
+                <w:bCs/>
+                <w:kern w:val="0"/>
+                <w:lang w:eastAsia="en-GB"/>
+                <w14:ligatures w14:val="none"/>
+              </w:rPr>
+              <w:t>Parameter / Metric</w:t>
+            </w:r>
+          </w:p>
+        </w:tc>
+        <w:tc>
+          <w:tcPr>
+            <w:tcW w:w="0" w:type="auto"/>
+            <w:vAlign w:val="center"/>
+            <w:hideMark/>
+          </w:tcPr>
+          <w:p>
+            <w:pPr>
+              <w:jc w:val="center"/>
+              <w:rPr>
+                <w:rFonts w:ascii="Times New Roman" w:eastAsia="Times New Roman" w:hAnsi="Times New Roman" w:cs="Times New Roman"/>
+                <w:b/>
+                <w:bCs/>
+                <w:kern w:val="0"/>
+                <w:lang w:eastAsia="en-GB"/>
+                <w14:ligatures w14:val="none"/>
+              </w:rPr>
+            </w:pPr>
+            <w:r>
+              <w:rPr>
+                <w:rFonts w:ascii="Times New Roman" w:eastAsia="Times New Roman" w:hAnsi="Times New Roman" w:cs="Times New Roman"/>
+                <w:b/>
+                <w:bCs/>
+                <w:kern w:val="0"/>
+                <w:lang w:eastAsia="en-GB"/>
+                <w14:ligatures w14:val="none"/>
+              </w:rPr>
+              <w:t>Tracked Value</w:t>
+            </w:r>
+          </w:p>
+        </w:tc>
+      </w:tr>
+      <w:tr>
+        <w:trPr>
+          <w:tblCellSpacing w:w="15" w:type="dxa"/>
+        </w:trPr>
+        <w:tc>
+          <w:tcPr>
+            <w:tcW w:w="0" w:type="auto"/>
+            <w:vAlign w:val="center"/>
+            <w:hideMark/>
+          </w:tcPr>
+          <w:p>
+            <w:pPr>
+              <w:rPr>
+                <w:rFonts w:ascii="Times New Roman" w:eastAsia="Times New Roman" w:hAnsi="Times New Roman" w:cs="Times New Roman"/>
+                <w:kern w:val="0"/>
+                <w:lang w:eastAsia="en-GB"/>
+                <w14:ligatures w14:val="none"/>
+              </w:rPr>
+            </w:pPr>
+            <w:r>
+              <w:rPr>
+                <w:rFonts w:ascii="Times New Roman" w:eastAsia="Times New Roman" w:hAnsi="Times New Roman" w:cs="Times New Roman"/>
+                <w:b/>
+                <w:bCs/>
+                <w:kern w:val="0"/>
+                <w:lang w:eastAsia="en-GB"/>
+                <w14:ligatures w14:val="none"/>
+              </w:rPr>
+              <w:t>Model Architecture</w:t>
+            </w:r>
+          </w:p>
+        </w:tc>
+        <w:tc>
+          <w:tcPr>
+            <w:tcW w:w="0" w:type="auto"/>
+            <w:vAlign w:val="center"/>
+            <w:hideMark/>
+          </w:tcPr>
+          <w:p>
+            <w:pPr>
+              <w:rPr>
+                <w:rFonts w:ascii="Times New Roman" w:eastAsia="Times New Roman" w:hAnsi="Times New Roman" w:cs="Times New Roman"/>
+                <w:kern w:val="0"/>
+                <w:lang w:eastAsia="en-GB"/>
+                <w14:ligatures w14:val="none"/>
+              </w:rPr>
+            </w:pPr>
+            <w:r>
+              <w:rPr>
+                <w:rFonts w:ascii="Times New Roman" w:eastAsia="Times New Roman" w:hAnsi="Times New Roman" w:cs="Times New Roman"/>
+                <w:kern w:val="0"/>
+                <w:lang w:eastAsia="en-GB"/>
+                <w14:ligatures w14:val="none"/>
+              </w:rPr>
+              <w:t>MobileNetV2</w:t>
+            </w:r>
+          </w:p>
+        </w:tc>
+      </w:tr>
+      <w:tr>
+        <w:trPr>
+          <w:tblCellSpacing w:w="15" w:type="dxa"/>
+        </w:trPr>
+        <w:tc>
+          <w:tcPr>
+            <w:tcW w:w="0" w:type="auto"/>
+            <w:vAlign w:val="center"/>
+            <w:hideMark/>
+          </w:tcPr>
+          <w:p>
+            <w:pPr>
+              <w:rPr>
+                <w:rFonts w:ascii="Times New Roman" w:eastAsia="Times New Roman" w:hAnsi="Times New Roman" w:cs="Times New Roman"/>
+                <w:kern w:val="0"/>
+                <w:lang w:eastAsia="en-GB"/>
+                <w14:ligatures w14:val="none"/>
+              </w:rPr>
+            </w:pPr>
+            <w:r>
+              <w:rPr>
+                <w:rFonts w:ascii="Times New Roman" w:eastAsia="Times New Roman" w:hAnsi="Times New Roman" w:cs="Times New Roman"/>
+                <w:b/>
+                <w:bCs/>
+                <w:kern w:val="0"/>
+                <w:lang w:eastAsia="en-GB"/>
+                <w14:ligatures w14:val="none"/>
+              </w:rPr>
+              <w:t>Dataset Size</w:t>
+            </w:r>
+          </w:p>
+        </w:tc>
+        <w:tc>
+          <w:tcPr>
+            <w:tcW w:w="0" w:type="auto"/>
+            <w:vAlign w:val="center"/>
+            <w:hideMark/>
+          </w:tcPr>
+          <w:p>
+            <w:pPr>
+              <w:rPr>
+                <w:rFonts w:ascii="Times New Roman" w:eastAsia="Times New Roman" w:hAnsi="Times New Roman" w:cs="Times New Roman"/>
+                <w:kern w:val="0"/>
+                <w:lang w:eastAsia="en-GB"/>
+                <w14:ligatures w14:val="none"/>
+              </w:rPr>
+            </w:pPr>
+            <w:r>
+              <w:rPr>
+                <w:rFonts w:ascii="Times New Roman" w:eastAsia="Times New Roman" w:hAnsi="Times New Roman" w:cs="Times New Roman"/>
+                <w:kern w:val="0"/>
+                <w:lang w:eastAsia="en-GB"/>
+                <w14:ligatures w14:val="none"/>
+              </w:rPr>
+              <w:t>17,498 images</w:t>
+            </w:r>
+          </w:p>
+        </w:tc>
+      </w:tr>
+      <w:tr>
+        <w:trPr>
+          <w:tblCellSpacing w:w="15" w:type="dxa"/>
+        </w:trPr>
+        <w:tc>
+          <w:tcPr>
+            <w:tcW w:w="0" w:type="auto"/>
+            <w:vAlign w:val="center"/>
+            <w:hideMark/>
+          </w:tcPr>
+          <w:p>
+            <w:pPr>
+              <w:rPr>
+                <w:rFonts w:ascii="Times New Roman" w:eastAsia="Times New Roman" w:hAnsi="Times New Roman" w:cs="Times New Roman"/>
+                <w:kern w:val="0"/>
+                <w:lang w:eastAsia="en-GB"/>
+                <w14:ligatures w14:val="none"/>
+              </w:rPr>
+            </w:pPr>
+            <w:r>
+              <w:rPr>
+                <w:rFonts w:ascii="Times New Roman" w:eastAsia="Times New Roman" w:hAnsi="Times New Roman" w:cs="Times New Roman"/>
+                <w:b/>
+                <w:bCs/>
+                <w:kern w:val="0"/>
+                <w:lang w:eastAsia="en-GB"/>
+                <w14:ligatures w14:val="none"/>
+              </w:rPr>
+              <w:t>Epochs / Batch Size</w:t>
+            </w:r>
+          </w:p>
+        </w:tc>
+        <w:tc>
+          <w:tcPr>
+            <w:tcW w:w="0" w:type="auto"/>
+            <w:vAlign w:val="center"/>
+            <w:hideMark/>
+          </w:tcPr>
+          <w:p>
+            <w:pPr>
+              <w:rPr>
+                <w:rFonts w:ascii="Times New Roman" w:eastAsia="Times New Roman" w:hAnsi="Times New Roman" w:cs="Times New Roman"/>
+                <w:kern w:val="0"/>
+                <w:lang w:eastAsia="en-GB"/>
+                <w14:ligatures w14:val="none"/>
+              </w:rPr>
+            </w:pPr>
+            <w:r>
+              <w:rPr>
+                <w:rFonts w:ascii="Times New Roman" w:eastAsia="Times New Roman" w:hAnsi="Times New Roman" w:cs="Times New Roman"/>
+                <w:kern w:val="0"/>
+                <w:lang w:eastAsia="en-GB"/>
+                <w14:ligatures w14:val="none"/>
+              </w:rPr>
+              <w:t>5 / 32</w:t>
+            </w:r>
+          </w:p>
+        </w:tc>
+      </w:tr>
+      <w:tr>
+        <w:trPr>
+          <w:tblCellSpacing w:w="15" w:type="dxa"/>
+        </w:trPr>
+        <w:tc>
+          <w:tcPr>
+            <w:tcW w:w="0" w:type="auto"/>
+            <w:vAlign w:val="center"/>
+            <w:hideMark/>
+          </w:tcPr>
+          <w:p>
+            <w:pPr>
+              <w:rPr>
+                <w:rFonts w:ascii="Times New Roman" w:eastAsia="Times New Roman" w:hAnsi="Times New Roman" w:cs="Times New Roman"/>
+                <w:kern w:val="0"/>
+                <w:lang w:eastAsia="en-GB"/>
+                <w14:ligatures w14:val="none"/>
+              </w:rPr>
+            </w:pPr>
+            <w:r>
+              <w:rPr>
+                <w:rFonts w:ascii="Times New Roman" w:eastAsia="Times New Roman" w:hAnsi="Times New Roman" w:cs="Times New Roman"/>
+                <w:b/>
+                <w:bCs/>
+                <w:kern w:val="0"/>
+                <w:lang w:eastAsia="en-GB"/>
+                <w14:ligatures w14:val="none"/>
+              </w:rPr>
+              <w:t>Learning Rate (</w:t>
+            </w:r>
+            <w:proofErr w:type="spellStart"/>
+            <w:r>
+              <w:rPr>
+                <w:rFonts w:ascii="Times New Roman" w:eastAsia="Times New Roman" w:hAnsi="Times New Roman" w:cs="Times New Roman"/>
+                <w:b/>
+                <w:bCs/>
+                <w:kern w:val="0"/>
+                <w:lang w:eastAsia="en-GB"/>
+                <w14:ligatures w14:val="none"/>
+              </w:rPr>
+              <w:t>lr</w:t>
+            </w:r>
+            <w:proofErr w:type="spellEnd"/>
+            <w:r>
+              <w:rPr>
+                <w:rFonts w:ascii="Times New Roman" w:eastAsia="Times New Roman" w:hAnsi="Times New Roman" w:cs="Times New Roman"/>
+                <w:b/>
+                <w:bCs/>
+                <w:kern w:val="0"/>
+                <w:lang w:eastAsia="en-GB"/>
+                <w14:ligatures w14:val="none"/>
+              </w:rPr>
+              <w:t>)</w:t>
+            </w:r>
+          </w:p>
+        </w:tc>
+        <w:tc>
+          <w:tcPr>
+            <w:tcW w:w="0" w:type="auto"/>
+            <w:vAlign w:val="center"/>
+            <w:hideMark/>
+          </w:tcPr>
+          <w:p>
+            <w:pPr>
+              <w:rPr>
+                <w:rFonts w:ascii="Times New Roman" w:eastAsia="Times New Roman" w:hAnsi="Times New Roman" w:cs="Times New Roman"/>
+                <w:kern w:val="0"/>
+                <w:lang w:eastAsia="en-GB"/>
+                <w14:ligatures w14:val="none"/>
+              </w:rPr>
+            </w:pPr>
+            <w:r>
+              <w:rPr>
+                <w:rFonts w:ascii="Times New Roman" w:eastAsia="Times New Roman" w:hAnsi="Times New Roman" w:cs="Times New Roman"/>
+                <w:kern w:val="0"/>
+                <w:lang w:eastAsia="en-GB"/>
+                <w14:ligatures w14:val="none"/>
+              </w:rPr>
+              <w:t>0.001</w:t>
+            </w:r>
+          </w:p>
+        </w:tc>
+      </w:tr>
+      <w:tr>
+        <w:trPr>
+          <w:tblCellSpacing w:w="15" w:type="dxa"/>
+        </w:trPr>
+        <w:tc>
+          <w:tcPr>
+            <w:tcW w:w="0" w:type="auto"/>
+            <w:vAlign w:val="center"/>
+            <w:hideMark/>
+          </w:tcPr>
+          <w:p>
+            <w:pPr>
+              <w:rPr>
+                <w:rFonts w:ascii="Times New Roman" w:eastAsia="Times New Roman" w:hAnsi="Times New Roman" w:cs="Times New Roman"/>
+                <w:kern w:val="0"/>
+                <w:lang w:eastAsia="en-GB"/>
+                <w14:ligatures w14:val="none"/>
+              </w:rPr>
+            </w:pPr>
+            <w:r>
+              <w:rPr>
+                <w:rFonts w:ascii="Times New Roman" w:eastAsia="Times New Roman" w:hAnsi="Times New Roman" w:cs="Times New Roman"/>
+                <w:b/>
+                <w:bCs/>
+                <w:kern w:val="0"/>
+                <w:lang w:eastAsia="en-GB"/>
+                <w14:ligatures w14:val="none"/>
+              </w:rPr>
+              <w:t>Validation Accuracy</w:t>
+            </w:r>
+          </w:p>
+        </w:tc>
+        <w:tc>
+          <w:tcPr>
+            <w:tcW w:w="0" w:type="auto"/>
+            <w:vAlign w:val="center"/>
+            <w:hideMark/>
+          </w:tcPr>
+          <w:p>
+            <w:pPr>
+              <w:rPr>
+                <w:rFonts w:ascii="Times New Roman" w:eastAsia="Times New Roman" w:hAnsi="Times New Roman" w:cs="Times New Roman"/>
+                <w:kern w:val="0"/>
+                <w:lang w:eastAsia="en-GB"/>
+                <w14:ligatures w14:val="none"/>
+              </w:rPr>
+            </w:pPr>
+            <w:r>
+              <w:rPr>
+                <w:rFonts w:ascii="Times New Roman" w:eastAsia="Times New Roman" w:hAnsi="Times New Roman" w:cs="Times New Roman"/>
+                <w:kern w:val="0"/>
+                <w:lang w:eastAsia="en-GB"/>
+                <w14:ligatures w14:val="none"/>
+              </w:rPr>
+              <w:t>97.36%</w:t>
+            </w:r>
+          </w:p>
+        </w:tc>
+      </w:tr>
+    </w:tbl>
+    <w:p>
+      <w:pPr>
+        <w:spacing w:before="100" w:beforeAutospacing="1" w:after="100" w:afterAutospacing="1"/>
+        <w:outlineLvl w:val="1"/>
+        <w:rPr>
+          <w:rFonts w:ascii="Times New Roman" w:eastAsia="Times New Roman" w:hAnsi="Times New Roman" w:cs="Times New Roman"/>
+          <w:b/>
+          <w:bCs/>
+          <w:color w:val="000000"/>
+          <w:kern w:val="0"/>
+          <w:sz w:val="36"/>
+          <w:szCs w:val="36"/>
+          <w:lang w:eastAsia="en-GB"/>
+          <w14:ligatures w14:val="none"/>
+        </w:rPr>
+      </w:pPr>
+      <w:r>
+        <w:lastRenderedPageBreak/>
         <w:drawing>
-          <wp:inline distT="0" distB="0" distL="0" distR="0" wp14:anchorId="1917534B" wp14:editId="2E221CDB">
+          <wp:inline distT="0" distB="0" distL="0" distR="0" wp14:anchorId="2EACF772" wp14:editId="3C9D8CF5">
             <wp:extent cx="5731510" cy="3037840"/>
             <wp:effectExtent l="0" t="0" r="0" b="0"/>
             <wp:docPr id="1700916718" name="Picture 1"/>
@@ -86,7 +976,7 @@
                     <pic:cNvPicPr/>
                   </pic:nvPicPr>
                   <pic:blipFill>
-                    <a:blip r:embed="rId5"/>
+                    <a:blip r:embed="rId7"/>
                     <a:stretch>
                       <a:fillRect/>
                     </a:stretch>
@@ -106,25 +996,296 @@
           </wp:inline>
         </w:drawing>
       </w:r>
-    </w:p>
-    <w:p/>
-    <w:p>
-      <w:pPr>
-        <w:rPr>
-          <w:u w:val="single"/>
-        </w:rPr>
-      </w:pPr>
-      <w:r>
-        <w:rPr>
-          <w:u w:val="single"/>
-        </w:rPr>
-        <w:t>Screenshot 3</w:t>
+      <w:r>
+        <w:rPr>
+          <w:rFonts w:ascii="Times New Roman" w:eastAsia="Times New Roman" w:hAnsi="Times New Roman" w:cs="Times New Roman"/>
+          <w:b/>
+          <w:bCs/>
+          <w:color w:val="000000"/>
+          <w:kern w:val="0"/>
+          <w:sz w:val="36"/>
+          <w:szCs w:val="36"/>
+          <w:lang w:eastAsia="en-GB"/>
+          <w14:ligatures w14:val="none"/>
+        </w:rPr>
+        <w:t xml:space="preserve">3. </w:t>
+      </w:r>
+      <w:proofErr w:type="spellStart"/>
+      <w:r>
+        <w:rPr>
+          <w:rFonts w:ascii="Times New Roman" w:eastAsia="Times New Roman" w:hAnsi="Times New Roman" w:cs="Times New Roman"/>
+          <w:b/>
+          <w:bCs/>
+          <w:color w:val="000000"/>
+          <w:kern w:val="0"/>
+          <w:sz w:val="36"/>
+          <w:szCs w:val="36"/>
+          <w:lang w:eastAsia="en-GB"/>
+          <w14:ligatures w14:val="none"/>
+        </w:rPr>
+        <w:t>FastAPI</w:t>
+      </w:r>
+      <w:proofErr w:type="spellEnd"/>
+      <w:r>
+        <w:rPr>
+          <w:rFonts w:ascii="Times New Roman" w:eastAsia="Times New Roman" w:hAnsi="Times New Roman" w:cs="Times New Roman"/>
+          <w:b/>
+          <w:bCs/>
+          <w:color w:val="000000"/>
+          <w:kern w:val="0"/>
+          <w:sz w:val="36"/>
+          <w:szCs w:val="36"/>
+          <w:lang w:eastAsia="en-GB"/>
+          <w14:ligatures w14:val="none"/>
+        </w:rPr>
+        <w:t xml:space="preserve"> Deployment &amp; Real-time Inference</w:t>
       </w:r>
     </w:p>
     <w:p>
+      <w:pPr>
+        <w:spacing w:before="100" w:beforeAutospacing="1" w:after="100" w:afterAutospacing="1"/>
+        <w:rPr>
+          <w:rFonts w:ascii="Times New Roman" w:eastAsia="Times New Roman" w:hAnsi="Times New Roman" w:cs="Times New Roman"/>
+          <w:color w:val="000000"/>
+          <w:kern w:val="0"/>
+          <w:lang w:eastAsia="en-GB"/>
+          <w14:ligatures w14:val="none"/>
+        </w:rPr>
+      </w:pPr>
+      <w:r>
+        <w:rPr>
+          <w:rFonts w:ascii="Times New Roman" w:eastAsia="Times New Roman" w:hAnsi="Times New Roman" w:cs="Times New Roman"/>
+          <w:color w:val="000000"/>
+          <w:kern w:val="0"/>
+          <w:lang w:eastAsia="en-GB"/>
+          <w14:ligatures w14:val="none"/>
+        </w:rPr>
+        <w:t xml:space="preserve">A RESTful API was implemented using </w:t>
+      </w:r>
+      <w:proofErr w:type="spellStart"/>
+      <w:r>
+        <w:rPr>
+          <w:rFonts w:ascii="Times New Roman" w:eastAsia="Times New Roman" w:hAnsi="Times New Roman" w:cs="Times New Roman"/>
+          <w:color w:val="000000"/>
+          <w:kern w:val="0"/>
+          <w:lang w:eastAsia="en-GB"/>
+          <w14:ligatures w14:val="none"/>
+        </w:rPr>
+        <w:t>FastAPI</w:t>
+      </w:r>
+      <w:proofErr w:type="spellEnd"/>
+      <w:r>
+        <w:rPr>
+          <w:rFonts w:ascii="Times New Roman" w:eastAsia="Times New Roman" w:hAnsi="Times New Roman" w:cs="Times New Roman"/>
+          <w:color w:val="000000"/>
+          <w:kern w:val="0"/>
+          <w:lang w:eastAsia="en-GB"/>
+          <w14:ligatures w14:val="none"/>
+        </w:rPr>
+        <w:t xml:space="preserve"> to serve real-time predictions. The endpoint takes an uploaded image, resizes and normalizes the input tensor, and returns prediction probabilities.</w:t>
+      </w:r>
+    </w:p>
+    <w:p>
+      <w:pPr>
+        <w:numPr>
+          <w:ilvl w:val="0"/>
+          <w:numId w:val="2"/>
+        </w:numPr>
+        <w:spacing w:before="100" w:beforeAutospacing="1" w:after="100" w:afterAutospacing="1"/>
+        <w:rPr>
+          <w:rFonts w:ascii="Times New Roman" w:eastAsia="Times New Roman" w:hAnsi="Times New Roman" w:cs="Times New Roman"/>
+          <w:color w:val="000000"/>
+          <w:kern w:val="0"/>
+          <w:lang w:eastAsia="en-GB"/>
+          <w14:ligatures w14:val="none"/>
+        </w:rPr>
+      </w:pPr>
+      <w:r>
+        <w:rPr>
+          <w:rFonts w:ascii="Times New Roman" w:eastAsia="Times New Roman" w:hAnsi="Times New Roman" w:cs="Times New Roman"/>
+          <w:b/>
+          <w:bCs/>
+          <w:color w:val="000000"/>
+          <w:kern w:val="0"/>
+          <w:lang w:eastAsia="en-GB"/>
+          <w14:ligatures w14:val="none"/>
+        </w:rPr>
+        <w:t>Endpoint Tested:</w:t>
+      </w:r>
+      <w:r>
+        <w:rPr>
+          <w:rFonts w:ascii="Times New Roman" w:eastAsia="Times New Roman" w:hAnsi="Times New Roman" w:cs="Times New Roman"/>
+          <w:color w:val="000000"/>
+          <w:kern w:val="0"/>
+          <w:lang w:eastAsia="en-GB"/>
+          <w14:ligatures w14:val="none"/>
+        </w:rPr>
+        <w:t> </w:t>
+      </w:r>
+      <w:r>
+        <w:rPr>
+          <w:rFonts w:ascii="Courier New" w:eastAsia="Times New Roman" w:hAnsi="Courier New" w:cs="Courier New"/>
+          <w:color w:val="000000"/>
+          <w:kern w:val="0"/>
+          <w:sz w:val="20"/>
+          <w:szCs w:val="20"/>
+          <w:lang w:eastAsia="en-GB"/>
+          <w14:ligatures w14:val="none"/>
+        </w:rPr>
+        <w:t>POST /predict</w:t>
+      </w:r>
+    </w:p>
+    <w:p>
+      <w:pPr>
+        <w:numPr>
+          <w:ilvl w:val="0"/>
+          <w:numId w:val="2"/>
+        </w:numPr>
+        <w:spacing w:before="100" w:beforeAutospacing="1" w:after="100" w:afterAutospacing="1"/>
+        <w:rPr>
+          <w:rFonts w:ascii="Times New Roman" w:eastAsia="Times New Roman" w:hAnsi="Times New Roman" w:cs="Times New Roman"/>
+          <w:color w:val="000000"/>
+          <w:kern w:val="0"/>
+          <w:lang w:eastAsia="en-GB"/>
+          <w14:ligatures w14:val="none"/>
+        </w:rPr>
+      </w:pPr>
+      <w:r>
+        <w:rPr>
+          <w:rFonts w:ascii="Times New Roman" w:eastAsia="Times New Roman" w:hAnsi="Times New Roman" w:cs="Times New Roman"/>
+          <w:b/>
+          <w:bCs/>
+          <w:color w:val="000000"/>
+          <w:kern w:val="0"/>
+          <w:lang w:eastAsia="en-GB"/>
+          <w14:ligatures w14:val="none"/>
+        </w:rPr>
+        <w:t>Sample Input:</w:t>
+      </w:r>
+      <w:r>
+        <w:rPr>
+          <w:rFonts w:ascii="Times New Roman" w:eastAsia="Times New Roman" w:hAnsi="Times New Roman" w:cs="Times New Roman"/>
+          <w:color w:val="000000"/>
+          <w:kern w:val="0"/>
+          <w:lang w:eastAsia="en-GB"/>
+          <w14:ligatures w14:val="none"/>
+        </w:rPr>
+        <w:t> </w:t>
+      </w:r>
+      <w:r>
+        <w:rPr>
+          <w:rFonts w:ascii="Courier New" w:eastAsia="Times New Roman" w:hAnsi="Courier New" w:cs="Courier New"/>
+          <w:color w:val="000000"/>
+          <w:kern w:val="0"/>
+          <w:sz w:val="20"/>
+          <w:szCs w:val="20"/>
+          <w:lang w:eastAsia="en-GB"/>
+          <w14:ligatures w14:val="none"/>
+        </w:rPr>
+        <w:t>3.jpg</w:t>
+      </w:r>
+    </w:p>
+    <w:p>
+      <w:pPr>
+        <w:numPr>
+          <w:ilvl w:val="0"/>
+          <w:numId w:val="2"/>
+        </w:numPr>
+        <w:spacing w:before="100" w:beforeAutospacing="1" w:after="100" w:afterAutospacing="1"/>
+        <w:rPr>
+          <w:rFonts w:ascii="Times New Roman" w:eastAsia="Times New Roman" w:hAnsi="Times New Roman" w:cs="Times New Roman"/>
+          <w:color w:val="000000"/>
+          <w:kern w:val="0"/>
+          <w:lang w:eastAsia="en-GB"/>
+          <w14:ligatures w14:val="none"/>
+        </w:rPr>
+      </w:pPr>
+      <w:r>
+        <w:rPr>
+          <w:rFonts w:ascii="Times New Roman" w:eastAsia="Times New Roman" w:hAnsi="Times New Roman" w:cs="Times New Roman"/>
+          <w:b/>
+          <w:bCs/>
+          <w:color w:val="000000"/>
+          <w:kern w:val="0"/>
+          <w:lang w:eastAsia="en-GB"/>
+          <w14:ligatures w14:val="none"/>
+        </w:rPr>
+        <w:t>Prediction Output:</w:t>
+      </w:r>
+      <w:r>
+        <w:rPr>
+          <w:rFonts w:ascii="Times New Roman" w:eastAsia="Times New Roman" w:hAnsi="Times New Roman" w:cs="Times New Roman"/>
+          <w:color w:val="000000"/>
+          <w:kern w:val="0"/>
+          <w:lang w:eastAsia="en-GB"/>
+          <w14:ligatures w14:val="none"/>
+        </w:rPr>
+        <w:t> </w:t>
+      </w:r>
+      <w:r>
+        <w:rPr>
+          <w:rFonts w:ascii="Courier New" w:eastAsia="Times New Roman" w:hAnsi="Courier New" w:cs="Courier New"/>
+          <w:color w:val="000000"/>
+          <w:kern w:val="0"/>
+          <w:sz w:val="20"/>
+          <w:szCs w:val="20"/>
+          <w:lang w:eastAsia="en-GB"/>
+          <w14:ligatures w14:val="none"/>
+        </w:rPr>
+        <w:t>Cat</w:t>
+      </w:r>
+      <w:r>
+        <w:rPr>
+          <w:rFonts w:ascii="Times New Roman" w:eastAsia="Times New Roman" w:hAnsi="Times New Roman" w:cs="Times New Roman"/>
+          <w:color w:val="000000"/>
+          <w:kern w:val="0"/>
+          <w:lang w:eastAsia="en-GB"/>
+          <w14:ligatures w14:val="none"/>
+        </w:rPr>
+        <w:t> (Confidence: </w:t>
+      </w:r>
+      <w:r>
+        <w:rPr>
+          <w:rFonts w:ascii="Times New Roman" w:eastAsia="Times New Roman" w:hAnsi="Times New Roman" w:cs="Times New Roman"/>
+          <w:b/>
+          <w:bCs/>
+          <w:color w:val="000000"/>
+          <w:kern w:val="0"/>
+          <w:lang w:eastAsia="en-GB"/>
+          <w14:ligatures w14:val="none"/>
+        </w:rPr>
+        <w:t>99.996%</w:t>
+      </w:r>
+      <w:r>
+        <w:rPr>
+          <w:rFonts w:ascii="Times New Roman" w:eastAsia="Times New Roman" w:hAnsi="Times New Roman" w:cs="Times New Roman"/>
+          <w:color w:val="000000"/>
+          <w:kern w:val="0"/>
+          <w:lang w:eastAsia="en-GB"/>
+          <w14:ligatures w14:val="none"/>
+        </w:rPr>
+        <w:t>)</w:t>
+      </w:r>
+    </w:p>
+    <w:p>
+      <w:pPr>
+        <w:spacing w:before="100" w:beforeAutospacing="1" w:after="100" w:afterAutospacing="1"/>
+        <w:outlineLvl w:val="1"/>
+        <w:rPr>
+          <w:rFonts w:ascii="Times New Roman" w:eastAsia="Times New Roman" w:hAnsi="Times New Roman" w:cs="Times New Roman"/>
+          <w:b/>
+          <w:bCs/>
+          <w:color w:val="000000"/>
+          <w:kern w:val="0"/>
+          <w:sz w:val="36"/>
+          <w:szCs w:val="36"/>
+          <w:lang w:eastAsia="en-GB"/>
+          <w14:ligatures w14:val="none"/>
+        </w:rPr>
+      </w:pPr>
       <w:r>
         <w:drawing>
-          <wp:inline distT="0" distB="0" distL="0" distR="0" wp14:anchorId="7565514D" wp14:editId="0BF34EC2">
+          <wp:inline distT="0" distB="0" distL="0" distR="0" wp14:anchorId="1DC253B6" wp14:editId="43123D5E">
             <wp:extent cx="5731510" cy="3187065"/>
             <wp:effectExtent l="0" t="0" r="0" b="635"/>
             <wp:docPr id="1400305458" name="Picture 1"/>
@@ -139,7 +1300,7 @@
                     <pic:cNvPicPr/>
                   </pic:nvPicPr>
                   <pic:blipFill>
-                    <a:blip r:embed="rId6"/>
+                    <a:blip r:embed="rId8"/>
                     <a:stretch>
                       <a:fillRect/>
                     </a:stretch>
@@ -159,71 +1320,247 @@
           </wp:inline>
         </w:drawing>
       </w:r>
-    </w:p>
-    <w:p/>
-    <w:p>
-      <w:pPr>
-        <w:rPr>
-          <w:u w:val="single"/>
-        </w:rPr>
-      </w:pPr>
-      <w:r>
-        <w:rPr>
-          <w:u w:val="single"/>
-        </w:rPr>
-        <w:lastRenderedPageBreak/>
-        <w:t>Screenshot 4</w:t>
+      <w:r>
+        <w:rPr>
+          <w:rFonts w:ascii="Times New Roman" w:eastAsia="Times New Roman" w:hAnsi="Times New Roman" w:cs="Times New Roman"/>
+          <w:b/>
+          <w:bCs/>
+          <w:color w:val="000000"/>
+          <w:kern w:val="0"/>
+          <w:sz w:val="36"/>
+          <w:szCs w:val="36"/>
+          <w:lang w:eastAsia="en-GB"/>
+          <w14:ligatures w14:val="none"/>
+        </w:rPr>
+        <w:t>4. Containerization with Docker</w:t>
       </w:r>
     </w:p>
     <w:p>
       <w:pPr>
-        <w:rPr>
-          <w:u w:val="single"/>
-        </w:rPr>
-      </w:pPr>
-      <w:r>
-        <w:rPr>
-          <w:u w:val="single"/>
-        </w:rPr>
-        <w:drawing>
-          <wp:inline distT="0" distB="0" distL="0" distR="0" wp14:anchorId="321EA0D3" wp14:editId="0C66E6CD">
-            <wp:extent cx="5731510" cy="3516630"/>
-            <wp:effectExtent l="0" t="0" r="0" b="1270"/>
-            <wp:docPr id="1518990569" name="Picture 1"/>
-            <wp:cNvGraphicFramePr>
-              <a:graphicFrameLocks xmlns:a="http://schemas.openxmlformats.org/drawingml/2006/main" noChangeAspect="1"/>
-            </wp:cNvGraphicFramePr>
-            <a:graphic xmlns:a="http://schemas.openxmlformats.org/drawingml/2006/main">
-              <a:graphicData uri="http://schemas.openxmlformats.org/drawingml/2006/picture">
-                <pic:pic xmlns:pic="http://schemas.openxmlformats.org/drawingml/2006/picture">
-                  <pic:nvPicPr>
-                    <pic:cNvPr id="1518990569" name=""/>
-                    <pic:cNvPicPr/>
-                  </pic:nvPicPr>
-                  <pic:blipFill>
-                    <a:blip r:embed="rId7"/>
-                    <a:stretch>
-                      <a:fillRect/>
-                    </a:stretch>
-                  </pic:blipFill>
-                  <pic:spPr>
-                    <a:xfrm>
-                      <a:off x="0" y="0"/>
-                      <a:ext cx="5731510" cy="3516630"/>
-                    </a:xfrm>
-                    <a:prstGeom prst="rect">
-                      <a:avLst/>
-                    </a:prstGeom>
-                  </pic:spPr>
-                </pic:pic>
-              </a:graphicData>
-            </a:graphic>
-          </wp:inline>
-        </w:drawing>
+        <w:spacing w:before="100" w:beforeAutospacing="1" w:after="100" w:afterAutospacing="1"/>
+        <w:rPr>
+          <w:rFonts w:ascii="Times New Roman" w:eastAsia="Times New Roman" w:hAnsi="Times New Roman" w:cs="Times New Roman"/>
+          <w:color w:val="000000"/>
+          <w:kern w:val="0"/>
+          <w:lang w:eastAsia="en-GB"/>
+          <w14:ligatures w14:val="none"/>
+        </w:rPr>
+      </w:pPr>
+      <w:r>
+        <w:rPr>
+          <w:rFonts w:ascii="Times New Roman" w:eastAsia="Times New Roman" w:hAnsi="Times New Roman" w:cs="Times New Roman"/>
+          <w:color w:val="000000"/>
+          <w:kern w:val="0"/>
+          <w:lang w:eastAsia="en-GB"/>
+          <w14:ligatures w14:val="none"/>
+        </w:rPr>
+        <w:lastRenderedPageBreak/>
+        <w:t>The application was containerized using a multi-stage Docker build with a Python 3.9 base image to ensure environment portability and isolation.</w:t>
       </w:r>
     </w:p>
     <w:p>
       <w:pPr>
+        <w:numPr>
+          <w:ilvl w:val="0"/>
+          <w:numId w:val="3"/>
+        </w:numPr>
+        <w:spacing w:before="100" w:beforeAutospacing="1" w:after="100" w:afterAutospacing="1"/>
+        <w:rPr>
+          <w:rFonts w:ascii="Times New Roman" w:eastAsia="Times New Roman" w:hAnsi="Times New Roman" w:cs="Times New Roman"/>
+          <w:color w:val="000000"/>
+          <w:kern w:val="0"/>
+          <w:lang w:eastAsia="en-GB"/>
+          <w14:ligatures w14:val="none"/>
+        </w:rPr>
+      </w:pPr>
+      <w:r>
+        <w:rPr>
+          <w:rFonts w:ascii="Times New Roman" w:eastAsia="Times New Roman" w:hAnsi="Times New Roman" w:cs="Times New Roman"/>
+          <w:b/>
+          <w:bCs/>
+          <w:color w:val="000000"/>
+          <w:kern w:val="0"/>
+          <w:lang w:eastAsia="en-GB"/>
+          <w14:ligatures w14:val="none"/>
+        </w:rPr>
+        <w:t>Container Image:</w:t>
+      </w:r>
+      <w:r>
+        <w:rPr>
+          <w:rFonts w:ascii="Times New Roman" w:eastAsia="Times New Roman" w:hAnsi="Times New Roman" w:cs="Times New Roman"/>
+          <w:color w:val="000000"/>
+          <w:kern w:val="0"/>
+          <w:lang w:eastAsia="en-GB"/>
+          <w14:ligatures w14:val="none"/>
+        </w:rPr>
+        <w:t> </w:t>
+      </w:r>
+      <w:r>
+        <w:rPr>
+          <w:rFonts w:ascii="Courier New" w:eastAsia="Times New Roman" w:hAnsi="Courier New" w:cs="Courier New"/>
+          <w:color w:val="000000"/>
+          <w:kern w:val="0"/>
+          <w:sz w:val="20"/>
+          <w:szCs w:val="20"/>
+          <w:lang w:eastAsia="en-GB"/>
+          <w14:ligatures w14:val="none"/>
+        </w:rPr>
+        <w:t>cat-dog-classifier:v1</w:t>
+      </w:r>
+    </w:p>
+    <w:p>
+      <w:pPr>
+        <w:numPr>
+          <w:ilvl w:val="0"/>
+          <w:numId w:val="3"/>
+        </w:numPr>
+        <w:spacing w:before="100" w:beforeAutospacing="1" w:after="100" w:afterAutospacing="1"/>
+        <w:rPr>
+          <w:rFonts w:ascii="Times New Roman" w:eastAsia="Times New Roman" w:hAnsi="Times New Roman" w:cs="Times New Roman"/>
+          <w:color w:val="000000"/>
+          <w:kern w:val="0"/>
+          <w:lang w:eastAsia="en-GB"/>
+          <w14:ligatures w14:val="none"/>
+        </w:rPr>
+      </w:pPr>
+      <w:r>
+        <w:rPr>
+          <w:rFonts w:ascii="Times New Roman" w:eastAsia="Times New Roman" w:hAnsi="Times New Roman" w:cs="Times New Roman"/>
+          <w:b/>
+          <w:bCs/>
+          <w:color w:val="000000"/>
+          <w:kern w:val="0"/>
+          <w:lang w:eastAsia="en-GB"/>
+          <w14:ligatures w14:val="none"/>
+        </w:rPr>
+        <w:t>Container Name:</w:t>
+      </w:r>
+      <w:r>
+        <w:rPr>
+          <w:rFonts w:ascii="Times New Roman" w:eastAsia="Times New Roman" w:hAnsi="Times New Roman" w:cs="Times New Roman"/>
+          <w:color w:val="000000"/>
+          <w:kern w:val="0"/>
+          <w:lang w:eastAsia="en-GB"/>
+          <w14:ligatures w14:val="none"/>
+        </w:rPr>
+        <w:t> </w:t>
+      </w:r>
+      <w:proofErr w:type="spellStart"/>
+      <w:r>
+        <w:rPr>
+          <w:rFonts w:ascii="Courier New" w:eastAsia="Times New Roman" w:hAnsi="Courier New" w:cs="Courier New"/>
+          <w:color w:val="000000"/>
+          <w:kern w:val="0"/>
+          <w:sz w:val="20"/>
+          <w:szCs w:val="20"/>
+          <w:lang w:eastAsia="en-GB"/>
+          <w14:ligatures w14:val="none"/>
+        </w:rPr>
+        <w:t>ml_api</w:t>
+      </w:r>
+      <w:proofErr w:type="spellEnd"/>
+      <w:r>
+        <w:rPr>
+          <w:rFonts w:ascii="Times New Roman" w:eastAsia="Times New Roman" w:hAnsi="Times New Roman" w:cs="Times New Roman"/>
+          <w:color w:val="000000"/>
+          <w:kern w:val="0"/>
+          <w:lang w:eastAsia="en-GB"/>
+          <w14:ligatures w14:val="none"/>
+        </w:rPr>
+        <w:t> (Container ID: </w:t>
+      </w:r>
+      <w:r>
+        <w:rPr>
+          <w:rFonts w:ascii="Courier New" w:eastAsia="Times New Roman" w:hAnsi="Courier New" w:cs="Courier New"/>
+          <w:color w:val="000000"/>
+          <w:kern w:val="0"/>
+          <w:sz w:val="20"/>
+          <w:szCs w:val="20"/>
+          <w:lang w:eastAsia="en-GB"/>
+          <w14:ligatures w14:val="none"/>
+        </w:rPr>
+        <w:t>5b6fdf100414</w:t>
+      </w:r>
+      <w:r>
+        <w:rPr>
+          <w:rFonts w:ascii="Times New Roman" w:eastAsia="Times New Roman" w:hAnsi="Times New Roman" w:cs="Times New Roman"/>
+          <w:color w:val="000000"/>
+          <w:kern w:val="0"/>
+          <w:lang w:eastAsia="en-GB"/>
+          <w14:ligatures w14:val="none"/>
+        </w:rPr>
+        <w:t>)</w:t>
+      </w:r>
+    </w:p>
+    <w:p>
+      <w:pPr>
+        <w:numPr>
+          <w:ilvl w:val="0"/>
+          <w:numId w:val="3"/>
+        </w:numPr>
+        <w:spacing w:before="100" w:beforeAutospacing="1" w:after="100" w:afterAutospacing="1"/>
+        <w:rPr>
+          <w:rFonts w:ascii="Times New Roman" w:eastAsia="Times New Roman" w:hAnsi="Times New Roman" w:cs="Times New Roman"/>
+          <w:color w:val="000000"/>
+          <w:kern w:val="0"/>
+          <w:lang w:eastAsia="en-GB"/>
+          <w14:ligatures w14:val="none"/>
+        </w:rPr>
+      </w:pPr>
+      <w:r>
+        <w:rPr>
+          <w:rFonts w:ascii="Times New Roman" w:eastAsia="Times New Roman" w:hAnsi="Times New Roman" w:cs="Times New Roman"/>
+          <w:b/>
+          <w:bCs/>
+          <w:color w:val="000000"/>
+          <w:kern w:val="0"/>
+          <w:lang w:eastAsia="en-GB"/>
+          <w14:ligatures w14:val="none"/>
+        </w:rPr>
+        <w:t>Port Mapping:</w:t>
+      </w:r>
+      <w:r>
+        <w:rPr>
+          <w:rFonts w:ascii="Times New Roman" w:eastAsia="Times New Roman" w:hAnsi="Times New Roman" w:cs="Times New Roman"/>
+          <w:color w:val="000000"/>
+          <w:kern w:val="0"/>
+          <w:lang w:eastAsia="en-GB"/>
+          <w14:ligatures w14:val="none"/>
+        </w:rPr>
+        <w:t> Exposed locally on </w:t>
+      </w:r>
+      <w:r>
+        <w:rPr>
+          <w:rFonts w:ascii="Courier New" w:eastAsia="Times New Roman" w:hAnsi="Courier New" w:cs="Courier New"/>
+          <w:color w:val="000000"/>
+          <w:kern w:val="0"/>
+          <w:sz w:val="20"/>
+          <w:szCs w:val="20"/>
+          <w:lang w:eastAsia="en-GB"/>
+          <w14:ligatures w14:val="none"/>
+        </w:rPr>
+        <w:t>0.0.0.0:8000-&gt;8000/</w:t>
+      </w:r>
+      <w:proofErr w:type="spellStart"/>
+      <w:r>
+        <w:rPr>
+          <w:rFonts w:ascii="Courier New" w:eastAsia="Times New Roman" w:hAnsi="Courier New" w:cs="Courier New"/>
+          <w:color w:val="000000"/>
+          <w:kern w:val="0"/>
+          <w:sz w:val="20"/>
+          <w:szCs w:val="20"/>
+          <w:lang w:eastAsia="en-GB"/>
+          <w14:ligatures w14:val="none"/>
+        </w:rPr>
+        <w:t>tcp</w:t>
+      </w:r>
+      <w:proofErr w:type="spellEnd"/>
+    </w:p>
+    <w:p>
+      <w:pPr>
+        <w:pBdr>
+          <w:bottom w:val="single" w:sz="12" w:space="1" w:color="auto"/>
+        </w:pBdr>
         <w:rPr>
           <w:u w:val="single"/>
         </w:rPr>
@@ -233,7 +1570,7 @@
           <w:u w:val="single"/>
         </w:rPr>
         <w:drawing>
-          <wp:inline distT="0" distB="0" distL="0" distR="0" wp14:anchorId="3BECD1BC" wp14:editId="00A93C94">
+          <wp:inline distT="0" distB="0" distL="0" distR="0" wp14:anchorId="7E413472" wp14:editId="268601A3">
             <wp:extent cx="5731510" cy="1826895"/>
             <wp:effectExtent l="0" t="0" r="0" b="1905"/>
             <wp:docPr id="516228137" name="Picture 1"/>
@@ -248,7 +1585,7 @@
                     <pic:cNvPicPr/>
                   </pic:nvPicPr>
                   <pic:blipFill>
-                    <a:blip r:embed="rId8"/>
+                    <a:blip r:embed="rId9"/>
                     <a:stretch>
                       <a:fillRect/>
                     </a:stretch>
@@ -269,20 +1606,6 @@
         </w:drawing>
       </w:r>
     </w:p>
-    <w:p>
-      <w:pPr>
-        <w:rPr>
-          <w:u w:val="single"/>
-        </w:rPr>
-      </w:pPr>
-    </w:p>
-    <w:p>
-      <w:pPr>
-        <w:rPr>
-          <w:u w:val="single"/>
-        </w:rPr>
-      </w:pPr>
-    </w:p>
     <w:sectPr>
       <w:pgSz w:w="11906" w:h="16838"/>
       <w:pgMar w:top="1440" w:right="1440" w:bottom="1440" w:left="1440" w:header="708" w:footer="708" w:gutter="0"/>
@@ -291,6 +1614,467 @@
     </w:sectPr>
   </w:body>
 </w:document>
+</file>
+
+<file path=word/numbering.xml><?xml version="1.0" encoding="utf-8"?>
+<w:numbering xmlns:wpc="http://schemas.microsoft.com/office/word/2010/wordprocessingCanvas" xmlns:cx="http://schemas.microsoft.com/office/drawing/2014/chartex" xmlns:cx1="http://schemas.microsoft.com/office/drawing/2015/9/8/chartex" xmlns:cx2="http://schemas.microsoft.com/office/drawing/2015/10/21/chartex" xmlns:cx3="http://schemas.microsoft.com/office/drawing/2016/5/9/chartex" xmlns:cx4="http://schemas.microsoft.com/office/drawing/2016/5/10/chartex" xmlns:cx5="http://schemas.microsoft.com/office/drawing/2016/5/11/chartex" xmlns:cx6="http://schemas.microsoft.com/office/drawing/2016/5/12/chartex" xmlns:cx7="http://schemas.microsoft.com/office/drawing/2016/5/13/chartex" xmlns:cx8="http://schemas.microsoft.com/office/drawing/2016/5/14/chartex" xmlns:mc="http://schemas.openxmlformats.org/markup-compatibility/2006" xmlns:aink="http://schemas.microsoft.com/office/drawing/2016/ink" xmlns:am3d="http://schemas.microsoft.com/office/drawing/2017/model3d" xmlns:o="urn:schemas-microsoft-com:office:office" xmlns:oel="http://schemas.microsoft.com/office/2019/extlst" xmlns:r="http://schemas.openxmlformats.org/officeDocument/2006/relationships" xmlns:m="http://schemas.openxmlformats.org/officeDocument/2006/math" xmlns:v="urn:schemas-microsoft-com:vml" xmlns:wp14="http://schemas.microsoft.com/office/word/2010/wordprocessingDrawing" xmlns:wp="http://schemas.openxmlformats.org/drawingml/2006/wordprocessingDrawing" xmlns:w10="urn:schemas-microsoft-com:office:word" xmlns:w="http://schemas.openxmlformats.org/wordprocessingml/2006/main" xmlns:w14="http://schemas.microsoft.com/office/word/2010/wordml" xmlns:w15="http://schemas.microsoft.com/office/word/2012/wordml" xmlns:w16cex="http://schemas.microsoft.com/office/word/2018/wordml/cex" xmlns:w16cid="http://schemas.microsoft.com/office/word/2016/wordml/cid" xmlns:w16="http://schemas.microsoft.com/office/word/2018/wordml" xmlns:w16sdtdh="http://schemas.microsoft.com/office/word/2020/wordml/sdtdatahash" xmlns:w16se="http://schemas.microsoft.com/office/word/2015/wordml/symex" xmlns:wpg="http://schemas.microsoft.com/office/word/2010/wordprocessingGroup" xmlns:wpi="http://schemas.microsoft.com/office/word/2010/wordprocessingInk" xmlns:wne="http://schemas.microsoft.com/office/word/2006/wordml" xmlns:wps="http://schemas.microsoft.com/office/word/2010/wordprocessingShape" mc:Ignorable="w14 w15 w16se w16cid w16 w16cex w16sdtdh wp14">
+  <w:abstractNum w:abstractNumId="0" w15:restartNumberingAfterBreak="0">
+    <w:nsid w:val="1E431892"/>
+    <w:multiLevelType w:val="multilevel"/>
+    <w:tmpl w:val="79F6481C"/>
+    <w:lvl w:ilvl="0">
+      <w:start w:val="1"/>
+      <w:numFmt w:val="bullet"/>
+      <w:lvlText w:val=""/>
+      <w:lvlJc w:val="left"/>
+      <w:pPr>
+        <w:tabs>
+          <w:tab w:val="num" w:pos="720"/>
+        </w:tabs>
+        <w:ind w:left="720" w:hanging="360"/>
+      </w:pPr>
+      <w:rPr>
+        <w:rFonts w:ascii="Symbol" w:hAnsi="Symbol" w:hint="default"/>
+        <w:sz w:val="20"/>
+      </w:rPr>
+    </w:lvl>
+    <w:lvl w:ilvl="1" w:tentative="1">
+      <w:start w:val="1"/>
+      <w:numFmt w:val="bullet"/>
+      <w:lvlText w:val="o"/>
+      <w:lvlJc w:val="left"/>
+      <w:pPr>
+        <w:tabs>
+          <w:tab w:val="num" w:pos="1440"/>
+        </w:tabs>
+        <w:ind w:left="1440" w:hanging="360"/>
+      </w:pPr>
+      <w:rPr>
+        <w:rFonts w:ascii="Courier New" w:hAnsi="Courier New" w:hint="default"/>
+        <w:sz w:val="20"/>
+      </w:rPr>
+    </w:lvl>
+    <w:lvl w:ilvl="2" w:tentative="1">
+      <w:start w:val="1"/>
+      <w:numFmt w:val="bullet"/>
+      <w:lvlText w:val=""/>
+      <w:lvlJc w:val="left"/>
+      <w:pPr>
+        <w:tabs>
+          <w:tab w:val="num" w:pos="2160"/>
+        </w:tabs>
+        <w:ind w:left="2160" w:hanging="360"/>
+      </w:pPr>
+      <w:rPr>
+        <w:rFonts w:ascii="Wingdings" w:hAnsi="Wingdings" w:hint="default"/>
+        <w:sz w:val="20"/>
+      </w:rPr>
+    </w:lvl>
+    <w:lvl w:ilvl="3" w:tentative="1">
+      <w:start w:val="1"/>
+      <w:numFmt w:val="bullet"/>
+      <w:lvlText w:val=""/>
+      <w:lvlJc w:val="left"/>
+      <w:pPr>
+        <w:tabs>
+          <w:tab w:val="num" w:pos="2880"/>
+        </w:tabs>
+        <w:ind w:left="2880" w:hanging="360"/>
+      </w:pPr>
+      <w:rPr>
+        <w:rFonts w:ascii="Wingdings" w:hAnsi="Wingdings" w:hint="default"/>
+        <w:sz w:val="20"/>
+      </w:rPr>
+    </w:lvl>
+    <w:lvl w:ilvl="4" w:tentative="1">
+      <w:start w:val="1"/>
+      <w:numFmt w:val="bullet"/>
+      <w:lvlText w:val=""/>
+      <w:lvlJc w:val="left"/>
+      <w:pPr>
+        <w:tabs>
+          <w:tab w:val="num" w:pos="3600"/>
+        </w:tabs>
+        <w:ind w:left="3600" w:hanging="360"/>
+      </w:pPr>
+      <w:rPr>
+        <w:rFonts w:ascii="Wingdings" w:hAnsi="Wingdings" w:hint="default"/>
+        <w:sz w:val="20"/>
+      </w:rPr>
+    </w:lvl>
+    <w:lvl w:ilvl="5" w:tentative="1">
+      <w:start w:val="1"/>
+      <w:numFmt w:val="bullet"/>
+      <w:lvlText w:val=""/>
+      <w:lvlJc w:val="left"/>
+      <w:pPr>
+        <w:tabs>
+          <w:tab w:val="num" w:pos="4320"/>
+        </w:tabs>
+        <w:ind w:left="4320" w:hanging="360"/>
+      </w:pPr>
+      <w:rPr>
+        <w:rFonts w:ascii="Wingdings" w:hAnsi="Wingdings" w:hint="default"/>
+        <w:sz w:val="20"/>
+      </w:rPr>
+    </w:lvl>
+    <w:lvl w:ilvl="6" w:tentative="1">
+      <w:start w:val="1"/>
+      <w:numFmt w:val="bullet"/>
+      <w:lvlText w:val=""/>
+      <w:lvlJc w:val="left"/>
+      <w:pPr>
+        <w:tabs>
+          <w:tab w:val="num" w:pos="5040"/>
+        </w:tabs>
+        <w:ind w:left="5040" w:hanging="360"/>
+      </w:pPr>
+      <w:rPr>
+        <w:rFonts w:ascii="Wingdings" w:hAnsi="Wingdings" w:hint="default"/>
+        <w:sz w:val="20"/>
+      </w:rPr>
+    </w:lvl>
+    <w:lvl w:ilvl="7" w:tentative="1">
+      <w:start w:val="1"/>
+      <w:numFmt w:val="bullet"/>
+      <w:lvlText w:val=""/>
+      <w:lvlJc w:val="left"/>
+      <w:pPr>
+        <w:tabs>
+          <w:tab w:val="num" w:pos="5760"/>
+        </w:tabs>
+        <w:ind w:left="5760" w:hanging="360"/>
+      </w:pPr>
+      <w:rPr>
+        <w:rFonts w:ascii="Wingdings" w:hAnsi="Wingdings" w:hint="default"/>
+        <w:sz w:val="20"/>
+      </w:rPr>
+    </w:lvl>
+    <w:lvl w:ilvl="8" w:tentative="1">
+      <w:start w:val="1"/>
+      <w:numFmt w:val="bullet"/>
+      <w:lvlText w:val=""/>
+      <w:lvlJc w:val="left"/>
+      <w:pPr>
+        <w:tabs>
+          <w:tab w:val="num" w:pos="6480"/>
+        </w:tabs>
+        <w:ind w:left="6480" w:hanging="360"/>
+      </w:pPr>
+      <w:rPr>
+        <w:rFonts w:ascii="Wingdings" w:hAnsi="Wingdings" w:hint="default"/>
+        <w:sz w:val="20"/>
+      </w:rPr>
+    </w:lvl>
+  </w:abstractNum>
+  <w:abstractNum w:abstractNumId="1" w15:restartNumberingAfterBreak="0">
+    <w:nsid w:val="246042B7"/>
+    <w:multiLevelType w:val="multilevel"/>
+    <w:tmpl w:val="5E42A73C"/>
+    <w:lvl w:ilvl="0">
+      <w:start w:val="1"/>
+      <w:numFmt w:val="bullet"/>
+      <w:lvlText w:val=""/>
+      <w:lvlJc w:val="left"/>
+      <w:pPr>
+        <w:tabs>
+          <w:tab w:val="num" w:pos="720"/>
+        </w:tabs>
+        <w:ind w:left="720" w:hanging="360"/>
+      </w:pPr>
+      <w:rPr>
+        <w:rFonts w:ascii="Symbol" w:hAnsi="Symbol" w:hint="default"/>
+        <w:sz w:val="20"/>
+      </w:rPr>
+    </w:lvl>
+    <w:lvl w:ilvl="1" w:tentative="1">
+      <w:start w:val="1"/>
+      <w:numFmt w:val="bullet"/>
+      <w:lvlText w:val="o"/>
+      <w:lvlJc w:val="left"/>
+      <w:pPr>
+        <w:tabs>
+          <w:tab w:val="num" w:pos="1440"/>
+        </w:tabs>
+        <w:ind w:left="1440" w:hanging="360"/>
+      </w:pPr>
+      <w:rPr>
+        <w:rFonts w:ascii="Courier New" w:hAnsi="Courier New" w:hint="default"/>
+        <w:sz w:val="20"/>
+      </w:rPr>
+    </w:lvl>
+    <w:lvl w:ilvl="2" w:tentative="1">
+      <w:start w:val="1"/>
+      <w:numFmt w:val="bullet"/>
+      <w:lvlText w:val=""/>
+      <w:lvlJc w:val="left"/>
+      <w:pPr>
+        <w:tabs>
+          <w:tab w:val="num" w:pos="2160"/>
+        </w:tabs>
+        <w:ind w:left="2160" w:hanging="360"/>
+      </w:pPr>
+      <w:rPr>
+        <w:rFonts w:ascii="Wingdings" w:hAnsi="Wingdings" w:hint="default"/>
+        <w:sz w:val="20"/>
+      </w:rPr>
+    </w:lvl>
+    <w:lvl w:ilvl="3" w:tentative="1">
+      <w:start w:val="1"/>
+      <w:numFmt w:val="bullet"/>
+      <w:lvlText w:val=""/>
+      <w:lvlJc w:val="left"/>
+      <w:pPr>
+        <w:tabs>
+          <w:tab w:val="num" w:pos="2880"/>
+        </w:tabs>
+        <w:ind w:left="2880" w:hanging="360"/>
+      </w:pPr>
+      <w:rPr>
+        <w:rFonts w:ascii="Wingdings" w:hAnsi="Wingdings" w:hint="default"/>
+        <w:sz w:val="20"/>
+      </w:rPr>
+    </w:lvl>
+    <w:lvl w:ilvl="4" w:tentative="1">
+      <w:start w:val="1"/>
+      <w:numFmt w:val="bullet"/>
+      <w:lvlText w:val=""/>
+      <w:lvlJc w:val="left"/>
+      <w:pPr>
+        <w:tabs>
+          <w:tab w:val="num" w:pos="3600"/>
+        </w:tabs>
+        <w:ind w:left="3600" w:hanging="360"/>
+      </w:pPr>
+      <w:rPr>
+        <w:rFonts w:ascii="Wingdings" w:hAnsi="Wingdings" w:hint="default"/>
+        <w:sz w:val="20"/>
+      </w:rPr>
+    </w:lvl>
+    <w:lvl w:ilvl="5" w:tentative="1">
+      <w:start w:val="1"/>
+      <w:numFmt w:val="bullet"/>
+      <w:lvlText w:val=""/>
+      <w:lvlJc w:val="left"/>
+      <w:pPr>
+        <w:tabs>
+          <w:tab w:val="num" w:pos="4320"/>
+        </w:tabs>
+        <w:ind w:left="4320" w:hanging="360"/>
+      </w:pPr>
+      <w:rPr>
+        <w:rFonts w:ascii="Wingdings" w:hAnsi="Wingdings" w:hint="default"/>
+        <w:sz w:val="20"/>
+      </w:rPr>
+    </w:lvl>
+    <w:lvl w:ilvl="6" w:tentative="1">
+      <w:start w:val="1"/>
+      <w:numFmt w:val="bullet"/>
+      <w:lvlText w:val=""/>
+      <w:lvlJc w:val="left"/>
+      <w:pPr>
+        <w:tabs>
+          <w:tab w:val="num" w:pos="5040"/>
+        </w:tabs>
+        <w:ind w:left="5040" w:hanging="360"/>
+      </w:pPr>
+      <w:rPr>
+        <w:rFonts w:ascii="Wingdings" w:hAnsi="Wingdings" w:hint="default"/>
+        <w:sz w:val="20"/>
+      </w:rPr>
+    </w:lvl>
+    <w:lvl w:ilvl="7" w:tentative="1">
+      <w:start w:val="1"/>
+      <w:numFmt w:val="bullet"/>
+      <w:lvlText w:val=""/>
+      <w:lvlJc w:val="left"/>
+      <w:pPr>
+        <w:tabs>
+          <w:tab w:val="num" w:pos="5760"/>
+        </w:tabs>
+        <w:ind w:left="5760" w:hanging="360"/>
+      </w:pPr>
+      <w:rPr>
+        <w:rFonts w:ascii="Wingdings" w:hAnsi="Wingdings" w:hint="default"/>
+        <w:sz w:val="20"/>
+      </w:rPr>
+    </w:lvl>
+    <w:lvl w:ilvl="8" w:tentative="1">
+      <w:start w:val="1"/>
+      <w:numFmt w:val="bullet"/>
+      <w:lvlText w:val=""/>
+      <w:lvlJc w:val="left"/>
+      <w:pPr>
+        <w:tabs>
+          <w:tab w:val="num" w:pos="6480"/>
+        </w:tabs>
+        <w:ind w:left="6480" w:hanging="360"/>
+      </w:pPr>
+      <w:rPr>
+        <w:rFonts w:ascii="Wingdings" w:hAnsi="Wingdings" w:hint="default"/>
+        <w:sz w:val="20"/>
+      </w:rPr>
+    </w:lvl>
+  </w:abstractNum>
+  <w:abstractNum w:abstractNumId="2" w15:restartNumberingAfterBreak="0">
+    <w:nsid w:val="74287C12"/>
+    <w:multiLevelType w:val="multilevel"/>
+    <w:tmpl w:val="27345532"/>
+    <w:lvl w:ilvl="0">
+      <w:start w:val="1"/>
+      <w:numFmt w:val="bullet"/>
+      <w:lvlText w:val=""/>
+      <w:lvlJc w:val="left"/>
+      <w:pPr>
+        <w:tabs>
+          <w:tab w:val="num" w:pos="720"/>
+        </w:tabs>
+        <w:ind w:left="720" w:hanging="360"/>
+      </w:pPr>
+      <w:rPr>
+        <w:rFonts w:ascii="Symbol" w:hAnsi="Symbol" w:hint="default"/>
+        <w:sz w:val="20"/>
+      </w:rPr>
+    </w:lvl>
+    <w:lvl w:ilvl="1" w:tentative="1">
+      <w:start w:val="1"/>
+      <w:numFmt w:val="bullet"/>
+      <w:lvlText w:val="o"/>
+      <w:lvlJc w:val="left"/>
+      <w:pPr>
+        <w:tabs>
+          <w:tab w:val="num" w:pos="1440"/>
+        </w:tabs>
+        <w:ind w:left="1440" w:hanging="360"/>
+      </w:pPr>
+      <w:rPr>
+        <w:rFonts w:ascii="Courier New" w:hAnsi="Courier New" w:hint="default"/>
+        <w:sz w:val="20"/>
+      </w:rPr>
+    </w:lvl>
+    <w:lvl w:ilvl="2" w:tentative="1">
+      <w:start w:val="1"/>
+      <w:numFmt w:val="bullet"/>
+      <w:lvlText w:val=""/>
+      <w:lvlJc w:val="left"/>
+      <w:pPr>
+        <w:tabs>
+          <w:tab w:val="num" w:pos="2160"/>
+        </w:tabs>
+        <w:ind w:left="2160" w:hanging="360"/>
+      </w:pPr>
+      <w:rPr>
+        <w:rFonts w:ascii="Wingdings" w:hAnsi="Wingdings" w:hint="default"/>
+        <w:sz w:val="20"/>
+      </w:rPr>
+    </w:lvl>
+    <w:lvl w:ilvl="3" w:tentative="1">
+      <w:start w:val="1"/>
+      <w:numFmt w:val="bullet"/>
+      <w:lvlText w:val=""/>
+      <w:lvlJc w:val="left"/>
+      <w:pPr>
+        <w:tabs>
+          <w:tab w:val="num" w:pos="2880"/>
+        </w:tabs>
+        <w:ind w:left="2880" w:hanging="360"/>
+      </w:pPr>
+      <w:rPr>
+        <w:rFonts w:ascii="Wingdings" w:hAnsi="Wingdings" w:hint="default"/>
+        <w:sz w:val="20"/>
+      </w:rPr>
+    </w:lvl>
+    <w:lvl w:ilvl="4" w:tentative="1">
+      <w:start w:val="1"/>
+      <w:numFmt w:val="bullet"/>
+      <w:lvlText w:val=""/>
+      <w:lvlJc w:val="left"/>
+      <w:pPr>
+        <w:tabs>
+          <w:tab w:val="num" w:pos="3600"/>
+        </w:tabs>
+        <w:ind w:left="3600" w:hanging="360"/>
+      </w:pPr>
+      <w:rPr>
+        <w:rFonts w:ascii="Wingdings" w:hAnsi="Wingdings" w:hint="default"/>
+        <w:sz w:val="20"/>
+      </w:rPr>
+    </w:lvl>
+    <w:lvl w:ilvl="5" w:tentative="1">
+      <w:start w:val="1"/>
+      <w:numFmt w:val="bullet"/>
+      <w:lvlText w:val=""/>
+      <w:lvlJc w:val="left"/>
+      <w:pPr>
+        <w:tabs>
+          <w:tab w:val="num" w:pos="4320"/>
+        </w:tabs>
+        <w:ind w:left="4320" w:hanging="360"/>
+      </w:pPr>
+      <w:rPr>
+        <w:rFonts w:ascii="Wingdings" w:hAnsi="Wingdings" w:hint="default"/>
+        <w:sz w:val="20"/>
+      </w:rPr>
+    </w:lvl>
+    <w:lvl w:ilvl="6" w:tentative="1">
+      <w:start w:val="1"/>
+      <w:numFmt w:val="bullet"/>
+      <w:lvlText w:val=""/>
+      <w:lvlJc w:val="left"/>
+      <w:pPr>
+        <w:tabs>
+          <w:tab w:val="num" w:pos="5040"/>
+        </w:tabs>
+        <w:ind w:left="5040" w:hanging="360"/>
+      </w:pPr>
+      <w:rPr>
+        <w:rFonts w:ascii="Wingdings" w:hAnsi="Wingdings" w:hint="default"/>
+        <w:sz w:val="20"/>
+      </w:rPr>
+    </w:lvl>
+    <w:lvl w:ilvl="7" w:tentative="1">
+      <w:start w:val="1"/>
+      <w:numFmt w:val="bullet"/>
+      <w:lvlText w:val=""/>
+      <w:lvlJc w:val="left"/>
+      <w:pPr>
+        <w:tabs>
+          <w:tab w:val="num" w:pos="5760"/>
+        </w:tabs>
+        <w:ind w:left="5760" w:hanging="360"/>
+      </w:pPr>
+      <w:rPr>
+        <w:rFonts w:ascii="Wingdings" w:hAnsi="Wingdings" w:hint="default"/>
+        <w:sz w:val="20"/>
+      </w:rPr>
+    </w:lvl>
+    <w:lvl w:ilvl="8" w:tentative="1">
+      <w:start w:val="1"/>
+      <w:numFmt w:val="bullet"/>
+      <w:lvlText w:val=""/>
+      <w:lvlJc w:val="left"/>
+      <w:pPr>
+        <w:tabs>
+          <w:tab w:val="num" w:pos="6480"/>
+        </w:tabs>
+        <w:ind w:left="6480" w:hanging="360"/>
+      </w:pPr>
+      <w:rPr>
+        <w:rFonts w:ascii="Wingdings" w:hAnsi="Wingdings" w:hint="default"/>
+        <w:sz w:val="20"/>
+      </w:rPr>
+    </w:lvl>
+  </w:abstractNum>
+  <w:num w:numId="1" w16cid:durableId="1528712762">
+    <w:abstractNumId w:val="2"/>
+  </w:num>
+  <w:num w:numId="2" w16cid:durableId="1896088156">
+    <w:abstractNumId w:val="0"/>
+  </w:num>
+  <w:num w:numId="3" w16cid:durableId="284772221">
+    <w:abstractNumId w:val="1"/>
+  </w:num>
+</w:numbering>
 </file>
 
 <file path=word/styles.xml><?xml version="1.0" encoding="utf-8"?>
@@ -690,6 +2474,50 @@
     <w:name w:val="Normal"/>
     <w:qFormat/>
   </w:style>
+  <w:style w:type="paragraph" w:styleId="Heading1">
+    <w:name w:val="heading 1"/>
+    <w:basedOn w:val="Normal"/>
+    <w:link w:val="Heading1Char"/>
+    <w:uiPriority w:val="9"/>
+    <w:qFormat/>
+    <w:rsid w:val="00A037CF"/>
+    <w:pPr>
+      <w:spacing w:before="100" w:beforeAutospacing="1" w:after="100" w:afterAutospacing="1"/>
+      <w:outlineLvl w:val="0"/>
+    </w:pPr>
+    <w:rPr>
+      <w:rFonts w:ascii="Times New Roman" w:eastAsia="Times New Roman" w:hAnsi="Times New Roman" w:cs="Times New Roman"/>
+      <w:b/>
+      <w:bCs/>
+      <w:kern w:val="36"/>
+      <w:sz w:val="48"/>
+      <w:szCs w:val="48"/>
+      <w:lang w:eastAsia="en-GB"/>
+      <w14:ligatures w14:val="none"/>
+    </w:rPr>
+  </w:style>
+  <w:style w:type="paragraph" w:styleId="Heading2">
+    <w:name w:val="heading 2"/>
+    <w:basedOn w:val="Normal"/>
+    <w:link w:val="Heading2Char"/>
+    <w:uiPriority w:val="9"/>
+    <w:qFormat/>
+    <w:rsid w:val="00A037CF"/>
+    <w:pPr>
+      <w:spacing w:before="100" w:beforeAutospacing="1" w:after="100" w:afterAutospacing="1"/>
+      <w:outlineLvl w:val="1"/>
+    </w:pPr>
+    <w:rPr>
+      <w:rFonts w:ascii="Times New Roman" w:eastAsia="Times New Roman" w:hAnsi="Times New Roman" w:cs="Times New Roman"/>
+      <w:b/>
+      <w:bCs/>
+      <w:kern w:val="0"/>
+      <w:sz w:val="36"/>
+      <w:szCs w:val="36"/>
+      <w:lang w:eastAsia="en-GB"/>
+      <w14:ligatures w14:val="none"/>
+    </w:rPr>
+  </w:style>
   <w:style w:type="character" w:default="1" w:styleId="DefaultParagraphFont">
     <w:name w:val="Default Paragraph Font"/>
     <w:uiPriority w:val="1"/>
@@ -716,6 +2544,87 @@
     <w:uiPriority w:val="99"/>
     <w:semiHidden/>
     <w:unhideWhenUsed/>
+  </w:style>
+  <w:style w:type="character" w:customStyle="1" w:styleId="apple-converted-space">
+    <w:name w:val="apple-converted-space"/>
+    <w:basedOn w:val="DefaultParagraphFont"/>
+    <w:rsid w:val="00A037CF"/>
+  </w:style>
+  <w:style w:type="character" w:styleId="HTMLCode">
+    <w:name w:val="HTML Code"/>
+    <w:basedOn w:val="DefaultParagraphFont"/>
+    <w:uiPriority w:val="99"/>
+    <w:semiHidden/>
+    <w:unhideWhenUsed/>
+    <w:rsid w:val="00A037CF"/>
+    <w:rPr>
+      <w:rFonts w:ascii="Courier New" w:eastAsia="Times New Roman" w:hAnsi="Courier New" w:cs="Courier New"/>
+      <w:sz w:val="20"/>
+      <w:szCs w:val="20"/>
+    </w:rPr>
+  </w:style>
+  <w:style w:type="character" w:customStyle="1" w:styleId="Heading1Char">
+    <w:name w:val="Heading 1 Char"/>
+    <w:basedOn w:val="DefaultParagraphFont"/>
+    <w:link w:val="Heading1"/>
+    <w:uiPriority w:val="9"/>
+    <w:rsid w:val="00A037CF"/>
+    <w:rPr>
+      <w:rFonts w:ascii="Times New Roman" w:eastAsia="Times New Roman" w:hAnsi="Times New Roman" w:cs="Times New Roman"/>
+      <w:b/>
+      <w:bCs/>
+      <w:kern w:val="36"/>
+      <w:sz w:val="48"/>
+      <w:szCs w:val="48"/>
+      <w:lang w:eastAsia="en-GB"/>
+      <w14:ligatures w14:val="none"/>
+    </w:rPr>
+  </w:style>
+  <w:style w:type="character" w:customStyle="1" w:styleId="Heading2Char">
+    <w:name w:val="Heading 2 Char"/>
+    <w:basedOn w:val="DefaultParagraphFont"/>
+    <w:link w:val="Heading2"/>
+    <w:uiPriority w:val="9"/>
+    <w:rsid w:val="00A037CF"/>
+    <w:rPr>
+      <w:rFonts w:ascii="Times New Roman" w:eastAsia="Times New Roman" w:hAnsi="Times New Roman" w:cs="Times New Roman"/>
+      <w:b/>
+      <w:bCs/>
+      <w:kern w:val="0"/>
+      <w:sz w:val="36"/>
+      <w:szCs w:val="36"/>
+      <w:lang w:eastAsia="en-GB"/>
+      <w14:ligatures w14:val="none"/>
+    </w:rPr>
+  </w:style>
+  <w:style w:type="paragraph" w:styleId="NormalWeb">
+    <w:name w:val="Normal (Web)"/>
+    <w:basedOn w:val="Normal"/>
+    <w:uiPriority w:val="99"/>
+    <w:semiHidden/>
+    <w:unhideWhenUsed/>
+    <w:rsid w:val="00A037CF"/>
+    <w:pPr>
+      <w:spacing w:before="100" w:beforeAutospacing="1" w:after="100" w:afterAutospacing="1"/>
+    </w:pPr>
+    <w:rPr>
+      <w:rFonts w:ascii="Times New Roman" w:eastAsia="Times New Roman" w:hAnsi="Times New Roman" w:cs="Times New Roman"/>
+      <w:kern w:val="0"/>
+      <w:lang w:eastAsia="en-GB"/>
+      <w14:ligatures w14:val="none"/>
+    </w:rPr>
+  </w:style>
+  <w:style w:type="character" w:styleId="Hyperlink">
+    <w:name w:val="Hyperlink"/>
+    <w:basedOn w:val="DefaultParagraphFont"/>
+    <w:uiPriority w:val="99"/>
+    <w:semiHidden/>
+    <w:unhideWhenUsed/>
+    <w:rsid w:val="00A037CF"/>
+    <w:rPr>
+      <w:color w:val="0000FF"/>
+      <w:u w:val="single"/>
+    </w:rPr>
   </w:style>
 </w:styles>
 </file>

</xml_diff>